<commit_message>
add libs demo 13 to 27
</commit_message>
<xml_diff>
--- a/Advance_Python/Advance Python.docx
+++ b/Advance_Python/Advance Python.docx
@@ -621,7 +621,7 @@
           <w:bCs/>
         </w:rPr>
         <w:pict w14:anchorId="30D55F82">
-          <v:rect id="_x0000_i1031" style="width:0;height:1.5pt" o:hralign="center" o:hrstd="t" o:hr="t" fillcolor="#a0a0a0" stroked="f"/>
+          <v:rect id="_x0000_i1025" style="width:0;height:1.5pt" o:hralign="center" o:hrstd="t" o:hr="t" fillcolor="#a0a0a0" stroked="f"/>
         </w:pict>
       </w:r>
     </w:p>
@@ -1109,7 +1109,7 @@
     <w:p>
       <w:r>
         <w:pict w14:anchorId="4C6EFCE4">
-          <v:rect id="_x0000_i1051" style="width:0;height:1.5pt" o:hralign="center" o:hrstd="t" o:hr="t" fillcolor="#a0a0a0" stroked="f"/>
+          <v:rect id="_x0000_i1026" style="width:0;height:1.5pt" o:hralign="center" o:hrstd="t" o:hr="t" fillcolor="#a0a0a0" stroked="f"/>
         </w:pict>
       </w:r>
     </w:p>
@@ -1267,7 +1267,7 @@
     <w:p>
       <w:r>
         <w:pict w14:anchorId="07DD5A87">
-          <v:rect id="_x0000_i1059" style="width:0;height:1.5pt" o:hralign="center" o:hrstd="t" o:hr="t" fillcolor="#a0a0a0" stroked="f"/>
+          <v:rect id="_x0000_i1027" style="width:0;height:1.5pt" o:hralign="center" o:hrstd="t" o:hr="t" fillcolor="#a0a0a0" stroked="f"/>
         </w:pict>
       </w:r>
     </w:p>
@@ -1634,7 +1634,7 @@
     <w:p>
       <w:r>
         <w:pict w14:anchorId="3A83388D">
-          <v:rect id="_x0000_i1415" style="width:0;height:1.5pt" o:hralign="center" o:hrstd="t" o:hr="t" fillcolor="#a0a0a0" stroked="f"/>
+          <v:rect id="_x0000_i1028" style="width:0;height:1.5pt" o:hralign="center" o:hrstd="t" o:hr="t" fillcolor="#a0a0a0" stroked="f"/>
         </w:pict>
       </w:r>
     </w:p>
@@ -2142,7 +2142,7 @@
     <w:p>
       <w:r>
         <w:pict w14:anchorId="17D52358">
-          <v:rect id="_x0000_i1417" style="width:0;height:1.5pt" o:hralign="center" o:hrstd="t" o:hr="t" fillcolor="#a0a0a0" stroked="f"/>
+          <v:rect id="_x0000_i1029" style="width:0;height:1.5pt" o:hralign="center" o:hrstd="t" o:hr="t" fillcolor="#a0a0a0" stroked="f"/>
         </w:pict>
       </w:r>
     </w:p>
@@ -2527,7 +2527,7 @@
     <w:p>
       <w:r>
         <w:pict w14:anchorId="77891EA1">
-          <v:rect id="_x0000_i1421" style="width:0;height:1.5pt" o:hralign="center" o:hrstd="t" o:hr="t" fillcolor="#a0a0a0" stroked="f"/>
+          <v:rect id="_x0000_i1030" style="width:0;height:1.5pt" o:hralign="center" o:hrstd="t" o:hr="t" fillcolor="#a0a0a0" stroked="f"/>
         </w:pict>
       </w:r>
     </w:p>
@@ -2554,7 +2554,7 @@
     <w:p>
       <w:r>
         <w:pict w14:anchorId="6268F887">
-          <v:rect id="_x0000_i1422" style="width:0;height:1.5pt" o:hralign="center" o:hrstd="t" o:hr="t" fillcolor="#a0a0a0" stroked="f"/>
+          <v:rect id="_x0000_i1031" style="width:0;height:1.5pt" o:hralign="center" o:hrstd="t" o:hr="t" fillcolor="#a0a0a0" stroked="f"/>
         </w:pict>
       </w:r>
     </w:p>
@@ -2734,7 +2734,7 @@
     <w:p>
       <w:r>
         <w:pict w14:anchorId="70133E90">
-          <v:rect id="_x0000_i1423" style="width:0;height:1.5pt" o:hralign="center" o:hrstd="t" o:hr="t" fillcolor="#a0a0a0" stroked="f"/>
+          <v:rect id="_x0000_i1032" style="width:0;height:1.5pt" o:hralign="center" o:hrstd="t" o:hr="t" fillcolor="#a0a0a0" stroked="f"/>
         </w:pict>
       </w:r>
     </w:p>
@@ -3082,7 +3082,7 @@
     <w:p>
       <w:r>
         <w:pict w14:anchorId="2D540D41">
-          <v:rect id="_x0000_i1424" style="width:0;height:1.5pt" o:hralign="center" o:hrstd="t" o:hr="t" fillcolor="#a0a0a0" stroked="f"/>
+          <v:rect id="_x0000_i1033" style="width:0;height:1.5pt" o:hralign="center" o:hrstd="t" o:hr="t" fillcolor="#a0a0a0" stroked="f"/>
         </w:pict>
       </w:r>
     </w:p>
@@ -3318,7 +3318,7 @@
     <w:p>
       <w:r>
         <w:pict w14:anchorId="0C8D42AB">
-          <v:rect id="_x0000_i1425" style="width:0;height:1.5pt" o:hralign="center" o:hrstd="t" o:hr="t" fillcolor="#a0a0a0" stroked="f"/>
+          <v:rect id="_x0000_i1034" style="width:0;height:1.5pt" o:hralign="center" o:hrstd="t" o:hr="t" fillcolor="#a0a0a0" stroked="f"/>
         </w:pict>
       </w:r>
     </w:p>
@@ -3365,7 +3365,7 @@
     <w:p>
       <w:r>
         <w:pict w14:anchorId="22435B9C">
-          <v:rect id="_x0000_i1426" style="width:0;height:1.5pt" o:hralign="center" o:hrstd="t" o:hr="t" fillcolor="#a0a0a0" stroked="f"/>
+          <v:rect id="_x0000_i1035" style="width:0;height:1.5pt" o:hralign="center" o:hrstd="t" o:hr="t" fillcolor="#a0a0a0" stroked="f"/>
         </w:pict>
       </w:r>
     </w:p>
@@ -3397,7 +3397,7 @@
     <w:p>
       <w:r>
         <w:pict w14:anchorId="0D1E4013">
-          <v:rect id="_x0000_i1427" style="width:0;height:1.5pt" o:hralign="center" o:hrstd="t" o:hr="t" fillcolor="#a0a0a0" stroked="f"/>
+          <v:rect id="_x0000_i1036" style="width:0;height:1.5pt" o:hralign="center" o:hrstd="t" o:hr="t" fillcolor="#a0a0a0" stroked="f"/>
         </w:pict>
       </w:r>
     </w:p>
@@ -3655,7 +3655,7 @@
     <w:p>
       <w:r>
         <w:pict w14:anchorId="1FF6DD82">
-          <v:rect id="_x0000_i1429" style="width:0;height:1.5pt" o:hralign="center" o:hrstd="t" o:hr="t" fillcolor="#a0a0a0" stroked="f"/>
+          <v:rect id="_x0000_i1037" style="width:0;height:1.5pt" o:hralign="center" o:hrstd="t" o:hr="t" fillcolor="#a0a0a0" stroked="f"/>
         </w:pict>
       </w:r>
     </w:p>
@@ -3953,7 +3953,7 @@
     <w:p>
       <w:r>
         <w:pict w14:anchorId="5C9C899C">
-          <v:rect id="_x0000_i1430" style="width:0;height:1.5pt" o:hralign="center" o:hrstd="t" o:hr="t" fillcolor="#a0a0a0" stroked="f"/>
+          <v:rect id="_x0000_i1038" style="width:0;height:1.5pt" o:hralign="center" o:hrstd="t" o:hr="t" fillcolor="#a0a0a0" stroked="f"/>
         </w:pict>
       </w:r>
     </w:p>
@@ -4156,7 +4156,7 @@
     <w:p>
       <w:r>
         <w:pict w14:anchorId="2A25BF05">
-          <v:rect id="_x0000_i1512" style="width:0;height:1.5pt" o:hralign="center" o:hrstd="t" o:hr="t" fillcolor="#a0a0a0" stroked="f"/>
+          <v:rect id="_x0000_i1039" style="width:0;height:1.5pt" o:hralign="center" o:hrstd="t" o:hr="t" fillcolor="#a0a0a0" stroked="f"/>
         </w:pict>
       </w:r>
     </w:p>
@@ -4423,7 +4423,7 @@
     <w:p>
       <w:r>
         <w:pict w14:anchorId="051DF996">
-          <v:rect id="_x0000_i1513" style="width:0;height:1.5pt" o:hralign="center" o:hrstd="t" o:hr="t" fillcolor="#a0a0a0" stroked="f"/>
+          <v:rect id="_x0000_i1040" style="width:0;height:1.5pt" o:hralign="center" o:hrstd="t" o:hr="t" fillcolor="#a0a0a0" stroked="f"/>
         </w:pict>
       </w:r>
     </w:p>
@@ -4517,7 +4517,7 @@
     <w:p>
       <w:r>
         <w:pict w14:anchorId="69FCB001">
-          <v:rect id="_x0000_i1514" style="width:0;height:1.5pt" o:hralign="center" o:hrstd="t" o:hr="t" fillcolor="#a0a0a0" stroked="f"/>
+          <v:rect id="_x0000_i1041" style="width:0;height:1.5pt" o:hralign="center" o:hrstd="t" o:hr="t" fillcolor="#a0a0a0" stroked="f"/>
         </w:pict>
       </w:r>
     </w:p>
@@ -4592,7 +4592,7 @@
     <w:p>
       <w:r>
         <w:pict w14:anchorId="1DF8FF44">
-          <v:rect id="_x0000_i1515" style="width:0;height:1.5pt" o:hralign="center" o:hrstd="t" o:hr="t" fillcolor="#a0a0a0" stroked="f"/>
+          <v:rect id="_x0000_i1042" style="width:0;height:1.5pt" o:hralign="center" o:hrstd="t" o:hr="t" fillcolor="#a0a0a0" stroked="f"/>
         </w:pict>
       </w:r>
     </w:p>
@@ -4879,7 +4879,7 @@
     <w:p>
       <w:r>
         <w:pict w14:anchorId="74659291">
-          <v:rect id="_x0000_i1516" style="width:0;height:1.5pt" o:hralign="center" o:hrstd="t" o:hr="t" fillcolor="#a0a0a0" stroked="f"/>
+          <v:rect id="_x0000_i1043" style="width:0;height:1.5pt" o:hralign="center" o:hrstd="t" o:hr="t" fillcolor="#a0a0a0" stroked="f"/>
         </w:pict>
       </w:r>
     </w:p>
@@ -4944,7 +4944,7 @@
     <w:p>
       <w:r>
         <w:pict w14:anchorId="77B4ADB9">
-          <v:rect id="_x0000_i1517" style="width:0;height:1.5pt" o:hralign="center" o:hrstd="t" o:hr="t" fillcolor="#a0a0a0" stroked="f"/>
+          <v:rect id="_x0000_i1044" style="width:0;height:1.5pt" o:hralign="center" o:hrstd="t" o:hr="t" fillcolor="#a0a0a0" stroked="f"/>
         </w:pict>
       </w:r>
     </w:p>
@@ -5165,7 +5165,7 @@
     <w:p>
       <w:r>
         <w:pict w14:anchorId="69798585">
-          <v:rect id="_x0000_i1518" style="width:0;height:1.5pt" o:hralign="center" o:hrstd="t" o:hr="t" fillcolor="#a0a0a0" stroked="f"/>
+          <v:rect id="_x0000_i1045" style="width:0;height:1.5pt" o:hralign="center" o:hrstd="t" o:hr="t" fillcolor="#a0a0a0" stroked="f"/>
         </w:pict>
       </w:r>
     </w:p>
@@ -5966,7 +5966,7 @@
     <w:p>
       <w:r>
         <w:pict w14:anchorId="7488FF75">
-          <v:rect id="_x0000_i1556" style="width:0;height:1.5pt" o:hralign="center" o:hrstd="t" o:hr="t" fillcolor="#a0a0a0" stroked="f"/>
+          <v:rect id="_x0000_i1046" style="width:0;height:1.5pt" o:hralign="center" o:hrstd="t" o:hr="t" fillcolor="#a0a0a0" stroked="f"/>
         </w:pict>
       </w:r>
     </w:p>
@@ -6864,7 +6864,7 @@
     <w:p>
       <w:r>
         <w:pict w14:anchorId="138136A9">
-          <v:rect id="_x0000_i1582" style="width:0;height:1.5pt" o:hralign="center" o:hrstd="t" o:hr="t" fillcolor="#a0a0a0" stroked="f"/>
+          <v:rect id="_x0000_i1047" style="width:0;height:1.5pt" o:hralign="center" o:hrstd="t" o:hr="t" fillcolor="#a0a0a0" stroked="f"/>
         </w:pict>
       </w:r>
     </w:p>
@@ -7327,7 +7327,7 @@
     <w:p>
       <w:r>
         <w:pict w14:anchorId="70580BE9">
-          <v:rect id="_x0000_i1590" style="width:0;height:1.5pt" o:hralign="center" o:hrstd="t" o:hr="t" fillcolor="#a0a0a0" stroked="f"/>
+          <v:rect id="_x0000_i1048" style="width:0;height:1.5pt" o:hralign="center" o:hrstd="t" o:hr="t" fillcolor="#a0a0a0" stroked="f"/>
         </w:pict>
       </w:r>
     </w:p>
@@ -7734,7 +7734,7 @@
     <w:p>
       <w:r>
         <w:pict w14:anchorId="4BA009B3">
-          <v:rect id="_x0000_i1616" style="width:0;height:1.5pt" o:hralign="center" o:hrstd="t" o:hr="t" fillcolor="#a0a0a0" stroked="f"/>
+          <v:rect id="_x0000_i1049" style="width:0;height:1.5pt" o:hralign="center" o:hrstd="t" o:hr="t" fillcolor="#a0a0a0" stroked="f"/>
         </w:pict>
       </w:r>
     </w:p>
@@ -7961,7 +7961,7 @@
     <w:p>
       <w:r>
         <w:pict w14:anchorId="55A100ED">
-          <v:rect id="_x0000_i1617" style="width:0;height:1.5pt" o:hralign="center" o:hrstd="t" o:hr="t" fillcolor="#a0a0a0" stroked="f"/>
+          <v:rect id="_x0000_i1050" style="width:0;height:1.5pt" o:hralign="center" o:hrstd="t" o:hr="t" fillcolor="#a0a0a0" stroked="f"/>
         </w:pict>
       </w:r>
     </w:p>
@@ -8199,7 +8199,7 @@
     <w:p>
       <w:r>
         <w:pict w14:anchorId="1CAD6954">
-          <v:rect id="_x0000_i1618" style="width:0;height:1.5pt" o:hralign="center" o:hrstd="t" o:hr="t" fillcolor="#a0a0a0" stroked="f"/>
+          <v:rect id="_x0000_i1051" style="width:0;height:1.5pt" o:hralign="center" o:hrstd="t" o:hr="t" fillcolor="#a0a0a0" stroked="f"/>
         </w:pict>
       </w:r>
     </w:p>
@@ -8270,7 +8270,7 @@
     <w:p>
       <w:r>
         <w:pict w14:anchorId="43AE7E34">
-          <v:rect id="_x0000_i1619" style="width:0;height:1.5pt" o:hralign="center" o:hrstd="t" o:hr="t" fillcolor="#a0a0a0" stroked="f"/>
+          <v:rect id="_x0000_i1052" style="width:0;height:1.5pt" o:hralign="center" o:hrstd="t" o:hr="t" fillcolor="#a0a0a0" stroked="f"/>
         </w:pict>
       </w:r>
     </w:p>
@@ -8341,7 +8341,7 @@
     <w:p>
       <w:r>
         <w:pict w14:anchorId="3B9B7E09">
-          <v:rect id="_x0000_i1696" style="width:0;height:1.5pt" o:hralign="center" o:hrstd="t" o:hr="t" fillcolor="#a0a0a0" stroked="f"/>
+          <v:rect id="_x0000_i1053" style="width:0;height:1.5pt" o:hralign="center" o:hrstd="t" o:hr="t" fillcolor="#a0a0a0" stroked="f"/>
         </w:pict>
       </w:r>
     </w:p>
@@ -8578,7 +8578,7 @@
     <w:p>
       <w:r>
         <w:pict w14:anchorId="573F0240">
-          <v:rect id="_x0000_i1697" style="width:0;height:1.5pt" o:hralign="center" o:hrstd="t" o:hr="t" fillcolor="#a0a0a0" stroked="f"/>
+          <v:rect id="_x0000_i1054" style="width:0;height:1.5pt" o:hralign="center" o:hrstd="t" o:hr="t" fillcolor="#a0a0a0" stroked="f"/>
         </w:pict>
       </w:r>
     </w:p>
@@ -8831,7 +8831,7 @@
     <w:p>
       <w:r>
         <w:pict w14:anchorId="27462911">
-          <v:rect id="_x0000_i1698" style="width:0;height:1.5pt" o:hralign="center" o:hrstd="t" o:hr="t" fillcolor="#a0a0a0" stroked="f"/>
+          <v:rect id="_x0000_i1055" style="width:0;height:1.5pt" o:hralign="center" o:hrstd="t" o:hr="t" fillcolor="#a0a0a0" stroked="f"/>
         </w:pict>
       </w:r>
     </w:p>
@@ -8896,7 +8896,7 @@
     <w:p>
       <w:r>
         <w:pict w14:anchorId="49A24685">
-          <v:rect id="_x0000_i1699" style="width:0;height:1.5pt" o:hralign="center" o:hrstd="t" o:hr="t" fillcolor="#a0a0a0" stroked="f"/>
+          <v:rect id="_x0000_i1056" style="width:0;height:1.5pt" o:hralign="center" o:hrstd="t" o:hr="t" fillcolor="#a0a0a0" stroked="f"/>
         </w:pict>
       </w:r>
     </w:p>
@@ -9261,7 +9261,7 @@
     <w:p>
       <w:r>
         <w:pict w14:anchorId="717831E2">
-          <v:rect id="_x0000_i1700" style="width:0;height:1.5pt" o:hralign="center" o:hrstd="t" o:hr="t" fillcolor="#a0a0a0" stroked="f"/>
+          <v:rect id="_x0000_i1057" style="width:0;height:1.5pt" o:hralign="center" o:hrstd="t" o:hr="t" fillcolor="#a0a0a0" stroked="f"/>
         </w:pict>
       </w:r>
     </w:p>
@@ -9432,7 +9432,7 @@
     <w:p>
       <w:r>
         <w:pict w14:anchorId="2B1E9594">
-          <v:rect id="_x0000_i1701" style="width:0;height:1.5pt" o:hralign="center" o:hrstd="t" o:hr="t" fillcolor="#a0a0a0" stroked="f"/>
+          <v:rect id="_x0000_i1058" style="width:0;height:1.5pt" o:hralign="center" o:hrstd="t" o:hr="t" fillcolor="#a0a0a0" stroked="f"/>
         </w:pict>
       </w:r>
     </w:p>
@@ -9730,7 +9730,7 @@
     <w:p>
       <w:r>
         <w:pict w14:anchorId="4F5D0696">
-          <v:rect id="_x0000_i1702" style="width:0;height:1.5pt" o:hralign="center" o:hrstd="t" o:hr="t" fillcolor="#a0a0a0" stroked="f"/>
+          <v:rect id="_x0000_i1059" style="width:0;height:1.5pt" o:hralign="center" o:hrstd="t" o:hr="t" fillcolor="#a0a0a0" stroked="f"/>
         </w:pict>
       </w:r>
     </w:p>
@@ -9948,7 +9948,7 @@
     <w:p>
       <w:r>
         <w:pict w14:anchorId="3ED28EB2">
-          <v:rect id="_x0000_i1703" style="width:0;height:1.5pt" o:hralign="center" o:hrstd="t" o:hr="t" fillcolor="#a0a0a0" stroked="f"/>
+          <v:rect id="_x0000_i1060" style="width:0;height:1.5pt" o:hralign="center" o:hrstd="t" o:hr="t" fillcolor="#a0a0a0" stroked="f"/>
         </w:pict>
       </w:r>
     </w:p>
@@ -10115,7 +10115,7 @@
     <w:p>
       <w:r>
         <w:pict w14:anchorId="2EB91337">
-          <v:rect id="_x0000_i1704" style="width:0;height:1.5pt" o:hralign="center" o:hrstd="t" o:hr="t" fillcolor="#a0a0a0" stroked="f"/>
+          <v:rect id="_x0000_i1061" style="width:0;height:1.5pt" o:hralign="center" o:hrstd="t" o:hr="t" fillcolor="#a0a0a0" stroked="f"/>
         </w:pict>
       </w:r>
     </w:p>
@@ -10328,7 +10328,7 @@
     <w:p>
       <w:r>
         <w:pict w14:anchorId="0D22E293">
-          <v:rect id="_x0000_i1705" style="width:0;height:1.5pt" o:hralign="center" o:hrstd="t" o:hr="t" fillcolor="#a0a0a0" stroked="f"/>
+          <v:rect id="_x0000_i1062" style="width:0;height:1.5pt" o:hralign="center" o:hrstd="t" o:hr="t" fillcolor="#a0a0a0" stroked="f"/>
         </w:pict>
       </w:r>
     </w:p>
@@ -10565,7 +10565,7 @@
     <w:p>
       <w:r>
         <w:pict w14:anchorId="0E5AE0B8">
-          <v:rect id="_x0000_i1706" style="width:0;height:1.5pt" o:hralign="center" o:hrstd="t" o:hr="t" fillcolor="#a0a0a0" stroked="f"/>
+          <v:rect id="_x0000_i1063" style="width:0;height:1.5pt" o:hralign="center" o:hrstd="t" o:hr="t" fillcolor="#a0a0a0" stroked="f"/>
         </w:pict>
       </w:r>
     </w:p>
@@ -10843,7 +10843,7 @@
     <w:p>
       <w:r>
         <w:pict w14:anchorId="4F6BB8FA">
-          <v:rect id="_x0000_i1707" style="width:0;height:1.5pt" o:hralign="center" o:hrstd="t" o:hr="t" fillcolor="#a0a0a0" stroked="f"/>
+          <v:rect id="_x0000_i1064" style="width:0;height:1.5pt" o:hralign="center" o:hrstd="t" o:hr="t" fillcolor="#a0a0a0" stroked="f"/>
         </w:pict>
       </w:r>
     </w:p>
@@ -11000,7 +11000,7 @@
     <w:p>
       <w:r>
         <w:pict w14:anchorId="30431CDC">
-          <v:rect id="_x0000_i1828" style="width:0;height:1.5pt" o:hralign="center" o:hrstd="t" o:hr="t" fillcolor="#a0a0a0" stroked="f"/>
+          <v:rect id="_x0000_i1065" style="width:0;height:1.5pt" o:hralign="center" o:hrstd="t" o:hr="t" fillcolor="#a0a0a0" stroked="f"/>
         </w:pict>
       </w:r>
     </w:p>
@@ -11245,7 +11245,7 @@
     <w:p>
       <w:r>
         <w:pict w14:anchorId="19B6FE4A">
-          <v:rect id="_x0000_i1829" style="width:0;height:1.5pt" o:hralign="center" o:hrstd="t" o:hr="t" fillcolor="#a0a0a0" stroked="f"/>
+          <v:rect id="_x0000_i1066" style="width:0;height:1.5pt" o:hralign="center" o:hrstd="t" o:hr="t" fillcolor="#a0a0a0" stroked="f"/>
         </w:pict>
       </w:r>
     </w:p>
@@ -11335,7 +11335,7 @@
     <w:p>
       <w:r>
         <w:pict w14:anchorId="1C46129C">
-          <v:rect id="_x0000_i1830" style="width:0;height:1.5pt" o:hralign="center" o:hrstd="t" o:hr="t" fillcolor="#a0a0a0" stroked="f"/>
+          <v:rect id="_x0000_i1067" style="width:0;height:1.5pt" o:hralign="center" o:hrstd="t" o:hr="t" fillcolor="#a0a0a0" stroked="f"/>
         </w:pict>
       </w:r>
     </w:p>
@@ -11406,7 +11406,7 @@
     <w:p>
       <w:r>
         <w:pict w14:anchorId="4744A737">
-          <v:rect id="_x0000_i1831" style="width:0;height:1.5pt" o:hralign="center" o:hrstd="t" o:hr="t" fillcolor="#a0a0a0" stroked="f"/>
+          <v:rect id="_x0000_i1068" style="width:0;height:1.5pt" o:hralign="center" o:hrstd="t" o:hr="t" fillcolor="#a0a0a0" stroked="f"/>
         </w:pict>
       </w:r>
     </w:p>
@@ -11677,7 +11677,7 @@
     <w:p>
       <w:r>
         <w:pict w14:anchorId="2FCFB9D4">
-          <v:rect id="_x0000_i1832" style="width:0;height:1.5pt" o:hralign="center" o:hrstd="t" o:hr="t" fillcolor="#a0a0a0" stroked="f"/>
+          <v:rect id="_x0000_i1069" style="width:0;height:1.5pt" o:hralign="center" o:hrstd="t" o:hr="t" fillcolor="#a0a0a0" stroked="f"/>
         </w:pict>
       </w:r>
     </w:p>
@@ -11859,7 +11859,7 @@
     <w:p>
       <w:r>
         <w:pict w14:anchorId="4F18D37B">
-          <v:rect id="_x0000_i1833" style="width:0;height:1.5pt" o:hralign="center" o:hrstd="t" o:hr="t" fillcolor="#a0a0a0" stroked="f"/>
+          <v:rect id="_x0000_i1070" style="width:0;height:1.5pt" o:hralign="center" o:hrstd="t" o:hr="t" fillcolor="#a0a0a0" stroked="f"/>
         </w:pict>
       </w:r>
     </w:p>
@@ -12324,7 +12324,7 @@
     <w:p>
       <w:r>
         <w:pict w14:anchorId="0675EAE2">
-          <v:rect id="_x0000_i1834" style="width:0;height:1.5pt" o:hralign="center" o:hrstd="t" o:hr="t" fillcolor="#a0a0a0" stroked="f"/>
+          <v:rect id="_x0000_i1071" style="width:0;height:1.5pt" o:hralign="center" o:hrstd="t" o:hr="t" fillcolor="#a0a0a0" stroked="f"/>
         </w:pict>
       </w:r>
     </w:p>
@@ -12501,7 +12501,7 @@
     <w:p>
       <w:r>
         <w:pict w14:anchorId="74C0815E">
-          <v:rect id="_x0000_i1835" style="width:0;height:1.5pt" o:hralign="center" o:hrstd="t" o:hr="t" fillcolor="#a0a0a0" stroked="f"/>
+          <v:rect id="_x0000_i1072" style="width:0;height:1.5pt" o:hralign="center" o:hrstd="t" o:hr="t" fillcolor="#a0a0a0" stroked="f"/>
         </w:pict>
       </w:r>
     </w:p>
@@ -12630,7 +12630,7 @@
     <w:p>
       <w:r>
         <w:pict w14:anchorId="182FE5DE">
-          <v:rect id="_x0000_i1836" style="width:0;height:1.5pt" o:hralign="center" o:hrstd="t" o:hr="t" fillcolor="#a0a0a0" stroked="f"/>
+          <v:rect id="_x0000_i1073" style="width:0;height:1.5pt" o:hralign="center" o:hrstd="t" o:hr="t" fillcolor="#a0a0a0" stroked="f"/>
         </w:pict>
       </w:r>
     </w:p>
@@ -12792,7 +12792,7 @@
     <w:p>
       <w:r>
         <w:pict w14:anchorId="00922CBA">
-          <v:rect id="_x0000_i1837" style="width:0;height:1.5pt" o:hralign="center" o:hrstd="t" o:hr="t" fillcolor="#a0a0a0" stroked="f"/>
+          <v:rect id="_x0000_i1074" style="width:0;height:1.5pt" o:hralign="center" o:hrstd="t" o:hr="t" fillcolor="#a0a0a0" stroked="f"/>
         </w:pict>
       </w:r>
     </w:p>
@@ -12922,7 +12922,7 @@
     <w:p>
       <w:r>
         <w:pict w14:anchorId="02CA7C18">
-          <v:rect id="_x0000_i1838" style="width:0;height:1.5pt" o:hralign="center" o:hrstd="t" o:hr="t" fillcolor="#a0a0a0" stroked="f"/>
+          <v:rect id="_x0000_i1075" style="width:0;height:1.5pt" o:hralign="center" o:hrstd="t" o:hr="t" fillcolor="#a0a0a0" stroked="f"/>
         </w:pict>
       </w:r>
     </w:p>
@@ -13022,7 +13022,7 @@
     <w:p>
       <w:r>
         <w:pict w14:anchorId="2D0751C1">
-          <v:rect id="_x0000_i1839" style="width:0;height:1.5pt" o:hralign="center" o:hrstd="t" o:hr="t" fillcolor="#a0a0a0" stroked="f"/>
+          <v:rect id="_x0000_i1076" style="width:0;height:1.5pt" o:hralign="center" o:hrstd="t" o:hr="t" fillcolor="#a0a0a0" stroked="f"/>
         </w:pict>
       </w:r>
     </w:p>
@@ -13204,7 +13204,7 @@
     <w:p>
       <w:r>
         <w:pict w14:anchorId="0CD81E76">
-          <v:rect id="_x0000_i1840" style="width:0;height:1.5pt" o:hralign="center" o:hrstd="t" o:hr="t" fillcolor="#a0a0a0" stroked="f"/>
+          <v:rect id="_x0000_i1077" style="width:0;height:1.5pt" o:hralign="center" o:hrstd="t" o:hr="t" fillcolor="#a0a0a0" stroked="f"/>
         </w:pict>
       </w:r>
     </w:p>
@@ -13386,7 +13386,7 @@
     <w:p>
       <w:r>
         <w:pict w14:anchorId="5A1548AE">
-          <v:rect id="_x0000_i1841" style="width:0;height:1.5pt" o:hralign="center" o:hrstd="t" o:hr="t" fillcolor="#a0a0a0" stroked="f"/>
+          <v:rect id="_x0000_i1078" style="width:0;height:1.5pt" o:hralign="center" o:hrstd="t" o:hr="t" fillcolor="#a0a0a0" stroked="f"/>
         </w:pict>
       </w:r>
     </w:p>
@@ -13497,7 +13497,7 @@
     <w:p>
       <w:r>
         <w:pict w14:anchorId="7D92190E">
-          <v:rect id="_x0000_i1842" style="width:0;height:1.5pt" o:hralign="center" o:hrstd="t" o:hr="t" fillcolor="#a0a0a0" stroked="f"/>
+          <v:rect id="_x0000_i1079" style="width:0;height:1.5pt" o:hralign="center" o:hrstd="t" o:hr="t" fillcolor="#a0a0a0" stroked="f"/>
         </w:pict>
       </w:r>
     </w:p>
@@ -13722,7 +13722,7 @@
     <w:p>
       <w:r>
         <w:pict w14:anchorId="68D82E83">
-          <v:rect id="_x0000_i1843" style="width:0;height:1.5pt" o:hralign="center" o:hrstd="t" o:hr="t" fillcolor="#a0a0a0" stroked="f"/>
+          <v:rect id="_x0000_i1080" style="width:0;height:1.5pt" o:hralign="center" o:hrstd="t" o:hr="t" fillcolor="#a0a0a0" stroked="f"/>
         </w:pict>
       </w:r>
     </w:p>
@@ -13953,7 +13953,7 @@
     <w:p>
       <w:r>
         <w:pict w14:anchorId="487D3E51">
-          <v:rect id="_x0000_i1844" style="width:0;height:1.5pt" o:hralign="center" o:hrstd="t" o:hr="t" fillcolor="#a0a0a0" stroked="f"/>
+          <v:rect id="_x0000_i1081" style="width:0;height:1.5pt" o:hralign="center" o:hrstd="t" o:hr="t" fillcolor="#a0a0a0" stroked="f"/>
         </w:pict>
       </w:r>
     </w:p>
@@ -14218,7 +14218,7 @@
     <w:p>
       <w:r>
         <w:pict w14:anchorId="24A14841">
-          <v:rect id="_x0000_i2033" style="width:0;height:1.5pt" o:hralign="center" o:hrstd="t" o:hr="t" fillcolor="#a0a0a0" stroked="f"/>
+          <v:rect id="_x0000_i1082" style="width:0;height:1.5pt" o:hralign="center" o:hrstd="t" o:hr="t" fillcolor="#a0a0a0" stroked="f"/>
         </w:pict>
       </w:r>
     </w:p>
@@ -14729,7 +14729,7 @@
     <w:p>
       <w:r>
         <w:pict w14:anchorId="5A5DA0BB">
-          <v:rect id="_x0000_i2034" style="width:0;height:1.5pt" o:hralign="center" o:hrstd="t" o:hr="t" fillcolor="#a0a0a0" stroked="f"/>
+          <v:rect id="_x0000_i1083" style="width:0;height:1.5pt" o:hralign="center" o:hrstd="t" o:hr="t" fillcolor="#a0a0a0" stroked="f"/>
         </w:pict>
       </w:r>
     </w:p>
@@ -14841,7 +14841,7 @@
     <w:p>
       <w:r>
         <w:pict w14:anchorId="54EC0BD6">
-          <v:rect id="_x0000_i2035" style="width:0;height:1.5pt" o:hralign="center" o:hrstd="t" o:hr="t" fillcolor="#a0a0a0" stroked="f"/>
+          <v:rect id="_x0000_i1084" style="width:0;height:1.5pt" o:hralign="center" o:hrstd="t" o:hr="t" fillcolor="#a0a0a0" stroked="f"/>
         </w:pict>
       </w:r>
     </w:p>
@@ -14948,7 +14948,7 @@
     <w:p>
       <w:r>
         <w:pict w14:anchorId="7E8EEBC7">
-          <v:rect id="_x0000_i2036" style="width:0;height:1.5pt" o:hralign="center" o:hrstd="t" o:hr="t" fillcolor="#a0a0a0" stroked="f"/>
+          <v:rect id="_x0000_i1085" style="width:0;height:1.5pt" o:hralign="center" o:hrstd="t" o:hr="t" fillcolor="#a0a0a0" stroked="f"/>
         </w:pict>
       </w:r>
     </w:p>
@@ -15445,7 +15445,7 @@
     <w:p>
       <w:r>
         <w:pict w14:anchorId="09CC5B44">
-          <v:rect id="_x0000_i2038" style="width:0;height:1.5pt" o:hralign="center" o:hrstd="t" o:hr="t" fillcolor="#a0a0a0" stroked="f"/>
+          <v:rect id="_x0000_i1086" style="width:0;height:1.5pt" o:hralign="center" o:hrstd="t" o:hr="t" fillcolor="#a0a0a0" stroked="f"/>
         </w:pict>
       </w:r>
     </w:p>
@@ -15467,7 +15467,7 @@
     <w:p>
       <w:r>
         <w:pict w14:anchorId="7FD5FB7E">
-          <v:rect id="_x0000_i2039" style="width:0;height:1.5pt" o:hralign="center" o:hrstd="t" o:hr="t" fillcolor="#a0a0a0" stroked="f"/>
+          <v:rect id="_x0000_i1087" style="width:0;height:1.5pt" o:hralign="center" o:hrstd="t" o:hr="t" fillcolor="#a0a0a0" stroked="f"/>
         </w:pict>
       </w:r>
     </w:p>
@@ -15526,7 +15526,7 @@
     <w:p>
       <w:r>
         <w:pict w14:anchorId="4F1E0F07">
-          <v:rect id="_x0000_i2040" style="width:0;height:1.5pt" o:hralign="center" o:hrstd="t" o:hr="t" fillcolor="#a0a0a0" stroked="f"/>
+          <v:rect id="_x0000_i1088" style="width:0;height:1.5pt" o:hralign="center" o:hrstd="t" o:hr="t" fillcolor="#a0a0a0" stroked="f"/>
         </w:pict>
       </w:r>
     </w:p>
@@ -15737,7 +15737,7 @@
     <w:p>
       <w:r>
         <w:pict w14:anchorId="4F335BEE">
-          <v:rect id="_x0000_i2041" style="width:0;height:1.5pt" o:hralign="center" o:hrstd="t" o:hr="t" fillcolor="#a0a0a0" stroked="f"/>
+          <v:rect id="_x0000_i1089" style="width:0;height:1.5pt" o:hralign="center" o:hrstd="t" o:hr="t" fillcolor="#a0a0a0" stroked="f"/>
         </w:pict>
       </w:r>
     </w:p>
@@ -15923,7 +15923,7 @@
     <w:p>
       <w:r>
         <w:pict w14:anchorId="005A91E1">
-          <v:rect id="_x0000_i2042" style="width:0;height:1.5pt" o:hralign="center" o:hrstd="t" o:hr="t" fillcolor="#a0a0a0" stroked="f"/>
+          <v:rect id="_x0000_i1090" style="width:0;height:1.5pt" o:hralign="center" o:hrstd="t" o:hr="t" fillcolor="#a0a0a0" stroked="f"/>
         </w:pict>
       </w:r>
     </w:p>
@@ -15997,7 +15997,7 @@
     <w:p>
       <w:r>
         <w:pict w14:anchorId="2D9B251A">
-          <v:rect id="_x0000_i2043" style="width:0;height:1.5pt" o:hralign="center" o:hrstd="t" o:hr="t" fillcolor="#a0a0a0" stroked="f"/>
+          <v:rect id="_x0000_i1091" style="width:0;height:1.5pt" o:hralign="center" o:hrstd="t" o:hr="t" fillcolor="#a0a0a0" stroked="f"/>
         </w:pict>
       </w:r>
     </w:p>
@@ -16132,7 +16132,7 @@
     <w:p>
       <w:r>
         <w:pict w14:anchorId="33EB3169">
-          <v:rect id="_x0000_i2044" style="width:0;height:1.5pt" o:hralign="center" o:hrstd="t" o:hr="t" fillcolor="#a0a0a0" stroked="f"/>
+          <v:rect id="_x0000_i1092" style="width:0;height:1.5pt" o:hralign="center" o:hrstd="t" o:hr="t" fillcolor="#a0a0a0" stroked="f"/>
         </w:pict>
       </w:r>
     </w:p>
@@ -16334,7 +16334,7 @@
     <w:p>
       <w:r>
         <w:pict w14:anchorId="60D35EA3">
-          <v:rect id="_x0000_i2045" style="width:0;height:1.5pt" o:hralign="center" o:hrstd="t" o:hr="t" fillcolor="#a0a0a0" stroked="f"/>
+          <v:rect id="_x0000_i1093" style="width:0;height:1.5pt" o:hralign="center" o:hrstd="t" o:hr="t" fillcolor="#a0a0a0" stroked="f"/>
         </w:pict>
       </w:r>
     </w:p>
@@ -16394,7 +16394,7 @@
     <w:p>
       <w:r>
         <w:pict w14:anchorId="27E276B9">
-          <v:rect id="_x0000_i2046" style="width:0;height:1.5pt" o:hralign="center" o:hrstd="t" o:hr="t" fillcolor="#a0a0a0" stroked="f"/>
+          <v:rect id="_x0000_i1094" style="width:0;height:1.5pt" o:hralign="center" o:hrstd="t" o:hr="t" fillcolor="#a0a0a0" stroked="f"/>
         </w:pict>
       </w:r>
     </w:p>
@@ -16456,7 +16456,7 @@
     <w:p>
       <w:r>
         <w:pict w14:anchorId="35F15313">
-          <v:rect id="_x0000_i2047" style="width:0;height:1.5pt" o:hralign="center" o:hrstd="t" o:hr="t" fillcolor="#a0a0a0" stroked="f"/>
+          <v:rect id="_x0000_i1095" style="width:0;height:1.5pt" o:hralign="center" o:hrstd="t" o:hr="t" fillcolor="#a0a0a0" stroked="f"/>
         </w:pict>
       </w:r>
     </w:p>
@@ -16659,7 +16659,7 @@
     <w:p>
       <w:r>
         <w:pict w14:anchorId="060CDEC4">
-          <v:rect id="_x0000_i2048" style="width:0;height:1.5pt" o:hralign="center" o:hrstd="t" o:hr="t" fillcolor="#a0a0a0" stroked="f"/>
+          <v:rect id="_x0000_i1096" style="width:0;height:1.5pt" o:hralign="center" o:hrstd="t" o:hr="t" fillcolor="#a0a0a0" stroked="f"/>
         </w:pict>
       </w:r>
     </w:p>
@@ -16901,7 +16901,7 @@
     <w:p>
       <w:r>
         <w:pict w14:anchorId="36CAB708">
-          <v:rect id="_x0000_i2049" style="width:0;height:1.5pt" o:hralign="center" o:hrstd="t" o:hr="t" fillcolor="#a0a0a0" stroked="f"/>
+          <v:rect id="_x0000_i1097" style="width:0;height:1.5pt" o:hralign="center" o:hrstd="t" o:hr="t" fillcolor="#a0a0a0" stroked="f"/>
         </w:pict>
       </w:r>
     </w:p>
@@ -16955,7 +16955,7 @@
     <w:p>
       <w:r>
         <w:pict w14:anchorId="19DC7FBB">
-          <v:rect id="_x0000_i2050" style="width:0;height:1.5pt" o:hralign="center" o:hrstd="t" o:hr="t" fillcolor="#a0a0a0" stroked="f"/>
+          <v:rect id="_x0000_i1098" style="width:0;height:1.5pt" o:hralign="center" o:hrstd="t" o:hr="t" fillcolor="#a0a0a0" stroked="f"/>
         </w:pict>
       </w:r>
     </w:p>
@@ -17178,7 +17178,7 @@
     <w:p>
       <w:r>
         <w:pict w14:anchorId="3B1CE9E6">
-          <v:rect id="_x0000_i2051" style="width:0;height:1.5pt" o:hralign="center" o:hrstd="t" o:hr="t" fillcolor="#a0a0a0" stroked="f"/>
+          <v:rect id="_x0000_i1099" style="width:0;height:1.5pt" o:hralign="center" o:hrstd="t" o:hr="t" fillcolor="#a0a0a0" stroked="f"/>
         </w:pict>
       </w:r>
     </w:p>
@@ -17345,7 +17345,7 @@
     <w:p>
       <w:r>
         <w:pict w14:anchorId="171094A3">
-          <v:rect id="_x0000_i2053" style="width:0;height:1.5pt" o:hralign="center" o:hrstd="t" o:hr="t" fillcolor="#a0a0a0" stroked="f"/>
+          <v:rect id="_x0000_i1100" style="width:0;height:1.5pt" o:hralign="center" o:hrstd="t" o:hr="t" fillcolor="#a0a0a0" stroked="f"/>
         </w:pict>
       </w:r>
     </w:p>
@@ -17388,7 +17388,7 @@
     <w:p>
       <w:r>
         <w:pict w14:anchorId="7222F625">
-          <v:rect id="_x0000_i2054" style="width:0;height:1.5pt" o:hralign="center" o:hrstd="t" o:hr="t" fillcolor="#a0a0a0" stroked="f"/>
+          <v:rect id="_x0000_i1101" style="width:0;height:1.5pt" o:hralign="center" o:hrstd="t" o:hr="t" fillcolor="#a0a0a0" stroked="f"/>
         </w:pict>
       </w:r>
     </w:p>
@@ -17431,7 +17431,7 @@
     <w:p>
       <w:r>
         <w:pict w14:anchorId="4249EDD7">
-          <v:rect id="_x0000_i2055" style="width:0;height:1.5pt" o:hralign="center" o:hrstd="t" o:hr="t" fillcolor="#a0a0a0" stroked="f"/>
+          <v:rect id="_x0000_i1102" style="width:0;height:1.5pt" o:hralign="center" o:hrstd="t" o:hr="t" fillcolor="#a0a0a0" stroked="f"/>
         </w:pict>
       </w:r>
     </w:p>
@@ -17474,7 +17474,7 @@
     <w:p>
       <w:r>
         <w:pict w14:anchorId="29362973">
-          <v:rect id="_x0000_i2056" style="width:0;height:1.5pt" o:hralign="center" o:hrstd="t" o:hr="t" fillcolor="#a0a0a0" stroked="f"/>
+          <v:rect id="_x0000_i1103" style="width:0;height:1.5pt" o:hralign="center" o:hrstd="t" o:hr="t" fillcolor="#a0a0a0" stroked="f"/>
         </w:pict>
       </w:r>
     </w:p>
@@ -17644,7 +17644,7 @@
     <w:p>
       <w:r>
         <w:pict w14:anchorId="1DE0DA2D">
-          <v:rect id="_x0000_i2057" style="width:0;height:1.5pt" o:hralign="center" o:hrstd="t" o:hr="t" fillcolor="#a0a0a0" stroked="f"/>
+          <v:rect id="_x0000_i1104" style="width:0;height:1.5pt" o:hralign="center" o:hrstd="t" o:hr="t" fillcolor="#a0a0a0" stroked="f"/>
         </w:pict>
       </w:r>
     </w:p>
@@ -17978,7 +17978,7 @@
     <w:p>
       <w:r>
         <w:pict w14:anchorId="561EA911">
-          <v:rect id="_x0000_i2058" style="width:0;height:1.5pt" o:hralign="center" o:hrstd="t" o:hr="t" fillcolor="#a0a0a0" stroked="f"/>
+          <v:rect id="_x0000_i1105" style="width:0;height:1.5pt" o:hralign="center" o:hrstd="t" o:hr="t" fillcolor="#a0a0a0" stroked="f"/>
         </w:pict>
       </w:r>
     </w:p>
@@ -18093,7 +18093,7 @@
     <w:p>
       <w:r>
         <w:pict w14:anchorId="7148DE45">
-          <v:rect id="_x0000_i2059" style="width:0;height:1.5pt" o:hralign="center" o:hrstd="t" o:hr="t" fillcolor="#a0a0a0" stroked="f"/>
+          <v:rect id="_x0000_i1106" style="width:0;height:1.5pt" o:hralign="center" o:hrstd="t" o:hr="t" fillcolor="#a0a0a0" stroked="f"/>
         </w:pict>
       </w:r>
     </w:p>
@@ -18330,7 +18330,7 @@
     <w:p>
       <w:r>
         <w:pict w14:anchorId="1383E8E4">
-          <v:rect id="_x0000_i2060" style="width:0;height:1.5pt" o:hralign="center" o:hrstd="t" o:hr="t" fillcolor="#a0a0a0" stroked="f"/>
+          <v:rect id="_x0000_i1107" style="width:0;height:1.5pt" o:hralign="center" o:hrstd="t" o:hr="t" fillcolor="#a0a0a0" stroked="f"/>
         </w:pict>
       </w:r>
     </w:p>
@@ -18705,7 +18705,7 @@
     <w:p>
       <w:r>
         <w:pict w14:anchorId="08027C65">
-          <v:rect id="_x0000_i2224" style="width:0;height:1.5pt" o:hralign="center" o:hrstd="t" o:hr="t" fillcolor="#a0a0a0" stroked="f"/>
+          <v:rect id="_x0000_i1108" style="width:0;height:1.5pt" o:hralign="center" o:hrstd="t" o:hr="t" fillcolor="#a0a0a0" stroked="f"/>
         </w:pict>
       </w:r>
     </w:p>
@@ -18819,7 +18819,7 @@
     <w:p>
       <w:r>
         <w:pict w14:anchorId="626AEED4">
-          <v:rect id="_x0000_i2225" style="width:0;height:1.5pt" o:hralign="center" o:hrstd="t" o:hr="t" fillcolor="#a0a0a0" stroked="f"/>
+          <v:rect id="_x0000_i1109" style="width:0;height:1.5pt" o:hralign="center" o:hrstd="t" o:hr="t" fillcolor="#a0a0a0" stroked="f"/>
         </w:pict>
       </w:r>
     </w:p>
@@ -19106,7 +19106,7 @@
     <w:p>
       <w:r>
         <w:pict w14:anchorId="3B592770">
-          <v:rect id="_x0000_i2226" style="width:0;height:1.5pt" o:hralign="center" o:hrstd="t" o:hr="t" fillcolor="#a0a0a0" stroked="f"/>
+          <v:rect id="_x0000_i1110" style="width:0;height:1.5pt" o:hralign="center" o:hrstd="t" o:hr="t" fillcolor="#a0a0a0" stroked="f"/>
         </w:pict>
       </w:r>
     </w:p>
@@ -19420,7 +19420,7 @@
     <w:p>
       <w:r>
         <w:pict w14:anchorId="664AC728">
-          <v:rect id="_x0000_i2227" style="width:0;height:1.5pt" o:hralign="center" o:hrstd="t" o:hr="t" fillcolor="#a0a0a0" stroked="f"/>
+          <v:rect id="_x0000_i1111" style="width:0;height:1.5pt" o:hralign="center" o:hrstd="t" o:hr="t" fillcolor="#a0a0a0" stroked="f"/>
         </w:pict>
       </w:r>
     </w:p>
@@ -19615,7 +19615,7 @@
     <w:p>
       <w:r>
         <w:pict w14:anchorId="5DC730B5">
-          <v:rect id="_x0000_i2228" style="width:0;height:1.5pt" o:hralign="center" o:hrstd="t" o:hr="t" fillcolor="#a0a0a0" stroked="f"/>
+          <v:rect id="_x0000_i1112" style="width:0;height:1.5pt" o:hralign="center" o:hrstd="t" o:hr="t" fillcolor="#a0a0a0" stroked="f"/>
         </w:pict>
       </w:r>
     </w:p>
@@ -19853,7 +19853,7 @@
     <w:p>
       <w:r>
         <w:pict w14:anchorId="3DA46E2A">
-          <v:rect id="_x0000_i2229" style="width:0;height:1.5pt" o:hralign="center" o:hrstd="t" o:hr="t" fillcolor="#a0a0a0" stroked="f"/>
+          <v:rect id="_x0000_i1113" style="width:0;height:1.5pt" o:hralign="center" o:hrstd="t" o:hr="t" fillcolor="#a0a0a0" stroked="f"/>
         </w:pict>
       </w:r>
     </w:p>
@@ -20095,7 +20095,7 @@
     <w:p>
       <w:r>
         <w:pict w14:anchorId="68231600">
-          <v:rect id="_x0000_i2230" style="width:0;height:1.5pt" o:hralign="center" o:hrstd="t" o:hr="t" fillcolor="#a0a0a0" stroked="f"/>
+          <v:rect id="_x0000_i1114" style="width:0;height:1.5pt" o:hralign="center" o:hrstd="t" o:hr="t" fillcolor="#a0a0a0" stroked="f"/>
         </w:pict>
       </w:r>
     </w:p>
@@ -20190,7 +20190,7 @@
     <w:p>
       <w:r>
         <w:pict w14:anchorId="250FE88D">
-          <v:rect id="_x0000_i2231" style="width:0;height:1.5pt" o:hralign="center" o:hrstd="t" o:hr="t" fillcolor="#a0a0a0" stroked="f"/>
+          <v:rect id="_x0000_i1115" style="width:0;height:1.5pt" o:hralign="center" o:hrstd="t" o:hr="t" fillcolor="#a0a0a0" stroked="f"/>
         </w:pict>
       </w:r>
     </w:p>
@@ -20391,7 +20391,7 @@
     <w:p>
       <w:r>
         <w:pict w14:anchorId="6E5927EF">
-          <v:rect id="_x0000_i2232" style="width:0;height:1.5pt" o:hralign="center" o:hrstd="t" o:hr="t" fillcolor="#a0a0a0" stroked="f"/>
+          <v:rect id="_x0000_i1116" style="width:0;height:1.5pt" o:hralign="center" o:hrstd="t" o:hr="t" fillcolor="#a0a0a0" stroked="f"/>
         </w:pict>
       </w:r>
     </w:p>
@@ -20566,7 +20566,7 @@
     <w:p>
       <w:r>
         <w:pict w14:anchorId="6D5DFD4C">
-          <v:rect id="_x0000_i2233" style="width:0;height:1.5pt" o:hralign="center" o:hrstd="t" o:hr="t" fillcolor="#a0a0a0" stroked="f"/>
+          <v:rect id="_x0000_i1117" style="width:0;height:1.5pt" o:hralign="center" o:hrstd="t" o:hr="t" fillcolor="#a0a0a0" stroked="f"/>
         </w:pict>
       </w:r>
     </w:p>
@@ -20873,7 +20873,7 @@
     <w:p>
       <w:r>
         <w:pict w14:anchorId="49CB4804">
-          <v:rect id="_x0000_i2234" style="width:0;height:1.5pt" o:hralign="center" o:hrstd="t" o:hr="t" fillcolor="#a0a0a0" stroked="f"/>
+          <v:rect id="_x0000_i1118" style="width:0;height:1.5pt" o:hralign="center" o:hrstd="t" o:hr="t" fillcolor="#a0a0a0" stroked="f"/>
         </w:pict>
       </w:r>
     </w:p>
@@ -21049,7 +21049,7 @@
     <w:p>
       <w:r>
         <w:pict w14:anchorId="1696A197">
-          <v:rect id="_x0000_i2235" style="width:0;height:1.5pt" o:hralign="center" o:hrstd="t" o:hr="t" fillcolor="#a0a0a0" stroked="f"/>
+          <v:rect id="_x0000_i1119" style="width:0;height:1.5pt" o:hralign="center" o:hrstd="t" o:hr="t" fillcolor="#a0a0a0" stroked="f"/>
         </w:pict>
       </w:r>
     </w:p>
@@ -21148,7 +21148,7 @@
     <w:p>
       <w:r>
         <w:pict w14:anchorId="2BC1D30E">
-          <v:rect id="_x0000_i2236" style="width:0;height:1.5pt" o:hralign="center" o:hrstd="t" o:hr="t" fillcolor="#a0a0a0" stroked="f"/>
+          <v:rect id="_x0000_i1120" style="width:0;height:1.5pt" o:hralign="center" o:hrstd="t" o:hr="t" fillcolor="#a0a0a0" stroked="f"/>
         </w:pict>
       </w:r>
     </w:p>
@@ -21274,7 +21274,7 @@
     <w:p>
       <w:r>
         <w:pict w14:anchorId="45CA9894">
-          <v:rect id="_x0000_i2237" style="width:0;height:1.5pt" o:hralign="center" o:hrstd="t" o:hr="t" fillcolor="#a0a0a0" stroked="f"/>
+          <v:rect id="_x0000_i1121" style="width:0;height:1.5pt" o:hralign="center" o:hrstd="t" o:hr="t" fillcolor="#a0a0a0" stroked="f"/>
         </w:pict>
       </w:r>
     </w:p>
@@ -21476,7 +21476,7 @@
     <w:p>
       <w:r>
         <w:pict w14:anchorId="084C2D1A">
-          <v:rect id="_x0000_i2238" style="width:0;height:1.5pt" o:hralign="center" o:hrstd="t" o:hr="t" fillcolor="#a0a0a0" stroked="f"/>
+          <v:rect id="_x0000_i1122" style="width:0;height:1.5pt" o:hralign="center" o:hrstd="t" o:hr="t" fillcolor="#a0a0a0" stroked="f"/>
         </w:pict>
       </w:r>
     </w:p>
@@ -21714,7 +21714,7 @@
     <w:p>
       <w:r>
         <w:pict w14:anchorId="6D6AEEEC">
-          <v:rect id="_x0000_i2239" style="width:0;height:1.5pt" o:hralign="center" o:hrstd="t" o:hr="t" fillcolor="#a0a0a0" stroked="f"/>
+          <v:rect id="_x0000_i1123" style="width:0;height:1.5pt" o:hralign="center" o:hrstd="t" o:hr="t" fillcolor="#a0a0a0" stroked="f"/>
         </w:pict>
       </w:r>
     </w:p>
@@ -21921,7 +21921,7 @@
     <w:p>
       <w:r>
         <w:pict w14:anchorId="3A5CC194">
-          <v:rect id="_x0000_i2240" style="width:0;height:1.5pt" o:hralign="center" o:hrstd="t" o:hr="t" fillcolor="#a0a0a0" stroked="f"/>
+          <v:rect id="_x0000_i1124" style="width:0;height:1.5pt" o:hralign="center" o:hrstd="t" o:hr="t" fillcolor="#a0a0a0" stroked="f"/>
         </w:pict>
       </w:r>
     </w:p>
@@ -22010,26 +22010,51 @@
         <w:br w:type="page"/>
       </w:r>
     </w:p>
-    <w:p/>
-    <w:p>
-      <w:r>
-        <w:br w:type="page"/>
+    <w:p>
+      <w:pPr>
+        <w:rPr>
+          <w:b/>
+          <w:bCs/>
+          <w:sz w:val="36"/>
+          <w:szCs w:val="36"/>
+        </w:rPr>
+      </w:pPr>
+      <w:r>
+        <w:rPr>
+          <w:b/>
+          <w:bCs/>
+          <w:sz w:val="36"/>
+          <w:szCs w:val="36"/>
+        </w:rPr>
+        <w:lastRenderedPageBreak/>
+        <w:t>Some Useful Libraries in Python for Data Scien</w:t>
+      </w:r>
+      <w:r>
+        <w:rPr>
+          <w:b/>
+          <w:bCs/>
+          <w:sz w:val="36"/>
+          <w:szCs w:val="36"/>
+        </w:rPr>
+        <w:t>ce</w:t>
       </w:r>
     </w:p>
     <w:tbl>
       <w:tblPr>
         <w:tblStyle w:val="PlainTable1"/>
-        <w:tblW w:w="0" w:type="auto"/>
+        <w:tblW w:w="9537" w:type="dxa"/>
+        <w:tblInd w:w="-263" w:type="dxa"/>
         <w:tblLook w:val="04A0" w:firstRow="1" w:lastRow="0" w:firstColumn="1" w:lastColumn="0" w:noHBand="0" w:noVBand="1"/>
       </w:tblPr>
       <w:tblGrid>
-        <w:gridCol w:w="570"/>
-        <w:gridCol w:w="2377"/>
-        <w:gridCol w:w="3363"/>
+        <w:gridCol w:w="871"/>
+        <w:gridCol w:w="3589"/>
+        <w:gridCol w:w="5077"/>
       </w:tblGrid>
       <w:tr>
         <w:trPr>
           <w:cnfStyle w:val="100000000000" w:firstRow="1" w:lastRow="0" w:firstColumn="0" w:lastColumn="0" w:oddVBand="0" w:evenVBand="0" w:oddHBand="0" w:evenHBand="0" w:firstRowFirstColumn="0" w:firstRowLastColumn="0" w:lastRowFirstColumn="0" w:lastRowLastColumn="0"/>
+          <w:trHeight w:val="458"/>
         </w:trPr>
         <w:tc>
           <w:tcPr>
@@ -22053,7 +22078,6 @@
                 <w:szCs w:val="24"/>
                 <w:lang w:eastAsia="en-IN"/>
               </w:rPr>
-              <w:lastRenderedPageBreak/>
               <w:t>No.</w:t>
             </w:r>
           </w:p>
@@ -22116,6 +22140,7 @@
       <w:tr>
         <w:trPr>
           <w:cnfStyle w:val="000000100000" w:firstRow="0" w:lastRow="0" w:firstColumn="0" w:lastColumn="0" w:oddVBand="0" w:evenVBand="0" w:oddHBand="1" w:evenHBand="0" w:firstRowFirstColumn="0" w:firstRowLastColumn="0" w:lastRowFirstColumn="0" w:lastRowLastColumn="0"/>
+          <w:trHeight w:val="458"/>
         </w:trPr>
         <w:tc>
           <w:tcPr>
@@ -22199,6 +22224,9 @@
         </w:tc>
       </w:tr>
       <w:tr>
+        <w:trPr>
+          <w:trHeight w:val="458"/>
+        </w:trPr>
         <w:tc>
           <w:tcPr>
             <w:cnfStyle w:val="001000000000" w:firstRow="0" w:lastRow="0" w:firstColumn="1" w:lastColumn="0" w:oddVBand="0" w:evenVBand="0" w:oddHBand="0" w:evenHBand="0" w:firstRowFirstColumn="0" w:firstRowLastColumn="0" w:lastRowFirstColumn="0" w:lastRowLastColumn="0"/>
@@ -22213,6 +22241,15 @@
                 <w:lang w:eastAsia="en-IN"/>
               </w:rPr>
             </w:pPr>
+            <w:r>
+              <w:rPr>
+                <w:rFonts w:ascii="Courier New" w:eastAsia="Times New Roman" w:hAnsi="Courier New" w:cs="Courier New"/>
+                <w:sz w:val="20"/>
+                <w:szCs w:val="20"/>
+                <w:lang w:eastAsia="en-IN"/>
+              </w:rPr>
+              <w:t>2.</w:t>
+            </w:r>
           </w:p>
         </w:tc>
         <w:tc>
@@ -22272,6 +22309,7 @@
       <w:tr>
         <w:trPr>
           <w:cnfStyle w:val="000000100000" w:firstRow="0" w:lastRow="0" w:firstColumn="0" w:lastColumn="0" w:oddVBand="0" w:evenVBand="0" w:oddHBand="1" w:evenHBand="0" w:firstRowFirstColumn="0" w:firstRowLastColumn="0" w:lastRowFirstColumn="0" w:lastRowLastColumn="0"/>
+          <w:trHeight w:val="438"/>
         </w:trPr>
         <w:tc>
           <w:tcPr>
@@ -22287,6 +22325,15 @@
                 <w:lang w:eastAsia="en-IN"/>
               </w:rPr>
             </w:pPr>
+            <w:r>
+              <w:rPr>
+                <w:rFonts w:ascii="Courier New" w:eastAsia="Times New Roman" w:hAnsi="Courier New" w:cs="Courier New"/>
+                <w:sz w:val="20"/>
+                <w:szCs w:val="20"/>
+                <w:lang w:eastAsia="en-IN"/>
+              </w:rPr>
+              <w:t>3.</w:t>
+            </w:r>
           </w:p>
         </w:tc>
         <w:tc>
@@ -22344,6 +22391,9 @@
         </w:tc>
       </w:tr>
       <w:tr>
+        <w:trPr>
+          <w:trHeight w:val="458"/>
+        </w:trPr>
         <w:tc>
           <w:tcPr>
             <w:cnfStyle w:val="001000000000" w:firstRow="0" w:lastRow="0" w:firstColumn="1" w:lastColumn="0" w:oddVBand="0" w:evenVBand="0" w:oddHBand="0" w:evenHBand="0" w:firstRowFirstColumn="0" w:firstRowLastColumn="0" w:lastRowFirstColumn="0" w:lastRowLastColumn="0"/>
@@ -22358,6 +22408,15 @@
                 <w:lang w:eastAsia="en-IN"/>
               </w:rPr>
             </w:pPr>
+            <w:r>
+              <w:rPr>
+                <w:rFonts w:ascii="Courier New" w:eastAsia="Times New Roman" w:hAnsi="Courier New" w:cs="Courier New"/>
+                <w:sz w:val="20"/>
+                <w:szCs w:val="20"/>
+                <w:lang w:eastAsia="en-IN"/>
+              </w:rPr>
+              <w:t>4.</w:t>
+            </w:r>
           </w:p>
         </w:tc>
         <w:tc>
@@ -22417,6 +22476,7 @@
       <w:tr>
         <w:trPr>
           <w:cnfStyle w:val="000000100000" w:firstRow="0" w:lastRow="0" w:firstColumn="0" w:lastColumn="0" w:oddVBand="0" w:evenVBand="0" w:oddHBand="1" w:evenHBand="0" w:firstRowFirstColumn="0" w:firstRowLastColumn="0" w:lastRowFirstColumn="0" w:lastRowLastColumn="0"/>
+          <w:trHeight w:val="458"/>
         </w:trPr>
         <w:tc>
           <w:tcPr>
@@ -22432,6 +22492,15 @@
                 <w:lang w:eastAsia="en-IN"/>
               </w:rPr>
             </w:pPr>
+            <w:r>
+              <w:rPr>
+                <w:rFonts w:ascii="Courier New" w:eastAsia="Times New Roman" w:hAnsi="Courier New" w:cs="Courier New"/>
+                <w:sz w:val="20"/>
+                <w:szCs w:val="20"/>
+                <w:lang w:eastAsia="en-IN"/>
+              </w:rPr>
+              <w:t>5.</w:t>
+            </w:r>
           </w:p>
         </w:tc>
         <w:tc>
@@ -22489,6 +22558,9 @@
         </w:tc>
       </w:tr>
       <w:tr>
+        <w:trPr>
+          <w:trHeight w:val="458"/>
+        </w:trPr>
         <w:tc>
           <w:tcPr>
             <w:cnfStyle w:val="001000000000" w:firstRow="0" w:lastRow="0" w:firstColumn="1" w:lastColumn="0" w:oddVBand="0" w:evenVBand="0" w:oddHBand="0" w:evenHBand="0" w:firstRowFirstColumn="0" w:firstRowLastColumn="0" w:lastRowFirstColumn="0" w:lastRowLastColumn="0"/>
@@ -22503,6 +22575,15 @@
                 <w:lang w:eastAsia="en-IN"/>
               </w:rPr>
             </w:pPr>
+            <w:r>
+              <w:rPr>
+                <w:rFonts w:ascii="Courier New" w:eastAsia="Times New Roman" w:hAnsi="Courier New" w:cs="Courier New"/>
+                <w:sz w:val="20"/>
+                <w:szCs w:val="20"/>
+                <w:lang w:eastAsia="en-IN"/>
+              </w:rPr>
+              <w:t>6.</w:t>
+            </w:r>
           </w:p>
         </w:tc>
         <w:tc>
@@ -22562,6 +22643,7 @@
       <w:tr>
         <w:trPr>
           <w:cnfStyle w:val="000000100000" w:firstRow="0" w:lastRow="0" w:firstColumn="0" w:lastColumn="0" w:oddVBand="0" w:evenVBand="0" w:oddHBand="1" w:evenHBand="0" w:firstRowFirstColumn="0" w:firstRowLastColumn="0" w:lastRowFirstColumn="0" w:lastRowLastColumn="0"/>
+          <w:trHeight w:val="458"/>
         </w:trPr>
         <w:tc>
           <w:tcPr>
@@ -22577,6 +22659,15 @@
                 <w:lang w:eastAsia="en-IN"/>
               </w:rPr>
             </w:pPr>
+            <w:r>
+              <w:rPr>
+                <w:rFonts w:ascii="Courier New" w:eastAsia="Times New Roman" w:hAnsi="Courier New" w:cs="Courier New"/>
+                <w:sz w:val="20"/>
+                <w:szCs w:val="20"/>
+                <w:lang w:eastAsia="en-IN"/>
+              </w:rPr>
+              <w:t>7.</w:t>
+            </w:r>
           </w:p>
         </w:tc>
         <w:tc>
@@ -22634,6 +22725,9 @@
         </w:tc>
       </w:tr>
       <w:tr>
+        <w:trPr>
+          <w:trHeight w:val="458"/>
+        </w:trPr>
         <w:tc>
           <w:tcPr>
             <w:cnfStyle w:val="001000000000" w:firstRow="0" w:lastRow="0" w:firstColumn="1" w:lastColumn="0" w:oddVBand="0" w:evenVBand="0" w:oddHBand="0" w:evenHBand="0" w:firstRowFirstColumn="0" w:firstRowLastColumn="0" w:lastRowFirstColumn="0" w:lastRowLastColumn="0"/>
@@ -22648,6 +22742,15 @@
                 <w:lang w:eastAsia="en-IN"/>
               </w:rPr>
             </w:pPr>
+            <w:r>
+              <w:rPr>
+                <w:rFonts w:ascii="Courier New" w:eastAsia="Times New Roman" w:hAnsi="Courier New" w:cs="Courier New"/>
+                <w:sz w:val="20"/>
+                <w:szCs w:val="20"/>
+                <w:lang w:eastAsia="en-IN"/>
+              </w:rPr>
+              <w:t>8.</w:t>
+            </w:r>
           </w:p>
         </w:tc>
         <w:tc>
@@ -22707,6 +22810,7 @@
       <w:tr>
         <w:trPr>
           <w:cnfStyle w:val="000000100000" w:firstRow="0" w:lastRow="0" w:firstColumn="0" w:lastColumn="0" w:oddVBand="0" w:evenVBand="0" w:oddHBand="1" w:evenHBand="0" w:firstRowFirstColumn="0" w:firstRowLastColumn="0" w:lastRowFirstColumn="0" w:lastRowLastColumn="0"/>
+          <w:trHeight w:val="438"/>
         </w:trPr>
         <w:tc>
           <w:tcPr>
@@ -22722,6 +22826,15 @@
                 <w:lang w:eastAsia="en-IN"/>
               </w:rPr>
             </w:pPr>
+            <w:r>
+              <w:rPr>
+                <w:rFonts w:ascii="Courier New" w:eastAsia="Times New Roman" w:hAnsi="Courier New" w:cs="Courier New"/>
+                <w:sz w:val="20"/>
+                <w:szCs w:val="20"/>
+                <w:lang w:eastAsia="en-IN"/>
+              </w:rPr>
+              <w:t>9.</w:t>
+            </w:r>
           </w:p>
         </w:tc>
         <w:tc>
@@ -22779,6 +22892,9 @@
         </w:tc>
       </w:tr>
       <w:tr>
+        <w:trPr>
+          <w:trHeight w:val="458"/>
+        </w:trPr>
         <w:tc>
           <w:tcPr>
             <w:cnfStyle w:val="001000000000" w:firstRow="0" w:lastRow="0" w:firstColumn="1" w:lastColumn="0" w:oddVBand="0" w:evenVBand="0" w:oddHBand="0" w:evenHBand="0" w:firstRowFirstColumn="0" w:firstRowLastColumn="0" w:lastRowFirstColumn="0" w:lastRowLastColumn="0"/>
@@ -22793,6 +22909,15 @@
                 <w:lang w:eastAsia="en-IN"/>
               </w:rPr>
             </w:pPr>
+            <w:r>
+              <w:rPr>
+                <w:rFonts w:ascii="Courier New" w:eastAsia="Times New Roman" w:hAnsi="Courier New" w:cs="Courier New"/>
+                <w:sz w:val="20"/>
+                <w:szCs w:val="20"/>
+                <w:lang w:eastAsia="en-IN"/>
+              </w:rPr>
+              <w:t>10.</w:t>
+            </w:r>
           </w:p>
         </w:tc>
         <w:tc>
@@ -22852,6 +22977,7 @@
       <w:tr>
         <w:trPr>
           <w:cnfStyle w:val="000000100000" w:firstRow="0" w:lastRow="0" w:firstColumn="0" w:lastColumn="0" w:oddVBand="0" w:evenVBand="0" w:oddHBand="1" w:evenHBand="0" w:firstRowFirstColumn="0" w:firstRowLastColumn="0" w:lastRowFirstColumn="0" w:lastRowLastColumn="0"/>
+          <w:trHeight w:val="458"/>
         </w:trPr>
         <w:tc>
           <w:tcPr>
@@ -22860,13 +22986,24 @@
           </w:tcPr>
           <w:p>
             <w:pPr>
+              <w:rPr>
+                <w:rFonts w:ascii="Courier New" w:eastAsia="Times New Roman" w:hAnsi="Courier New" w:cs="Courier New"/>
+                <w:b w:val="0"/>
+                <w:bCs w:val="0"/>
+                <w:sz w:val="20"/>
+                <w:szCs w:val="20"/>
+                <w:lang w:eastAsia="en-IN"/>
+              </w:rPr>
+            </w:pPr>
+            <w:r>
               <w:rPr>
                 <w:rFonts w:ascii="Courier New" w:eastAsia="Times New Roman" w:hAnsi="Courier New" w:cs="Courier New"/>
                 <w:sz w:val="20"/>
                 <w:szCs w:val="20"/>
                 <w:lang w:eastAsia="en-IN"/>
               </w:rPr>
-            </w:pPr>
+              <w:t>11.</w:t>
+            </w:r>
           </w:p>
         </w:tc>
         <w:tc>
@@ -22924,6 +23061,9 @@
         </w:tc>
       </w:tr>
       <w:tr>
+        <w:trPr>
+          <w:trHeight w:val="458"/>
+        </w:trPr>
         <w:tc>
           <w:tcPr>
             <w:cnfStyle w:val="001000000000" w:firstRow="0" w:lastRow="0" w:firstColumn="1" w:lastColumn="0" w:oddVBand="0" w:evenVBand="0" w:oddHBand="0" w:evenHBand="0" w:firstRowFirstColumn="0" w:firstRowLastColumn="0" w:lastRowFirstColumn="0" w:lastRowLastColumn="0"/>
@@ -22938,6 +23078,15 @@
                 <w:lang w:eastAsia="en-IN"/>
               </w:rPr>
             </w:pPr>
+            <w:r>
+              <w:rPr>
+                <w:rFonts w:ascii="Courier New" w:eastAsia="Times New Roman" w:hAnsi="Courier New" w:cs="Courier New"/>
+                <w:sz w:val="20"/>
+                <w:szCs w:val="20"/>
+                <w:lang w:eastAsia="en-IN"/>
+              </w:rPr>
+              <w:t>12.</w:t>
+            </w:r>
           </w:p>
         </w:tc>
         <w:tc>
@@ -22997,6 +23146,7 @@
       <w:tr>
         <w:trPr>
           <w:cnfStyle w:val="000000100000" w:firstRow="0" w:lastRow="0" w:firstColumn="0" w:lastColumn="0" w:oddVBand="0" w:evenVBand="0" w:oddHBand="1" w:evenHBand="0" w:firstRowFirstColumn="0" w:firstRowLastColumn="0" w:lastRowFirstColumn="0" w:lastRowLastColumn="0"/>
+          <w:trHeight w:val="458"/>
         </w:trPr>
         <w:tc>
           <w:tcPr>
@@ -23012,6 +23162,15 @@
                 <w:lang w:eastAsia="en-IN"/>
               </w:rPr>
             </w:pPr>
+            <w:r>
+              <w:rPr>
+                <w:rFonts w:ascii="Courier New" w:eastAsia="Times New Roman" w:hAnsi="Courier New" w:cs="Courier New"/>
+                <w:sz w:val="20"/>
+                <w:szCs w:val="20"/>
+                <w:lang w:eastAsia="en-IN"/>
+              </w:rPr>
+              <w:t>13.</w:t>
+            </w:r>
           </w:p>
         </w:tc>
         <w:tc>
@@ -23069,6 +23228,9 @@
         </w:tc>
       </w:tr>
       <w:tr>
+        <w:trPr>
+          <w:trHeight w:val="458"/>
+        </w:trPr>
         <w:tc>
           <w:tcPr>
             <w:cnfStyle w:val="001000000000" w:firstRow="0" w:lastRow="0" w:firstColumn="1" w:lastColumn="0" w:oddVBand="0" w:evenVBand="0" w:oddHBand="0" w:evenHBand="0" w:firstRowFirstColumn="0" w:firstRowLastColumn="0" w:lastRowFirstColumn="0" w:lastRowLastColumn="0"/>
@@ -23083,6 +23245,15 @@
                 <w:lang w:eastAsia="en-IN"/>
               </w:rPr>
             </w:pPr>
+            <w:r>
+              <w:rPr>
+                <w:rFonts w:ascii="Courier New" w:eastAsia="Times New Roman" w:hAnsi="Courier New" w:cs="Courier New"/>
+                <w:sz w:val="20"/>
+                <w:szCs w:val="20"/>
+                <w:lang w:eastAsia="en-IN"/>
+              </w:rPr>
+              <w:t>14.</w:t>
+            </w:r>
           </w:p>
         </w:tc>
         <w:tc>
@@ -23142,6 +23313,7 @@
       <w:tr>
         <w:trPr>
           <w:cnfStyle w:val="000000100000" w:firstRow="0" w:lastRow="0" w:firstColumn="0" w:lastColumn="0" w:oddVBand="0" w:evenVBand="0" w:oddHBand="1" w:evenHBand="0" w:firstRowFirstColumn="0" w:firstRowLastColumn="0" w:lastRowFirstColumn="0" w:lastRowLastColumn="0"/>
+          <w:trHeight w:val="438"/>
         </w:trPr>
         <w:tc>
           <w:tcPr>
@@ -23157,6 +23329,15 @@
                 <w:lang w:eastAsia="en-IN"/>
               </w:rPr>
             </w:pPr>
+            <w:r>
+              <w:rPr>
+                <w:rFonts w:ascii="Courier New" w:eastAsia="Times New Roman" w:hAnsi="Courier New" w:cs="Courier New"/>
+                <w:sz w:val="20"/>
+                <w:szCs w:val="20"/>
+                <w:lang w:eastAsia="en-IN"/>
+              </w:rPr>
+              <w:t>15.</w:t>
+            </w:r>
           </w:p>
         </w:tc>
         <w:tc>
@@ -23214,6 +23395,9 @@
         </w:tc>
       </w:tr>
       <w:tr>
+        <w:trPr>
+          <w:trHeight w:val="458"/>
+        </w:trPr>
         <w:tc>
           <w:tcPr>
             <w:cnfStyle w:val="001000000000" w:firstRow="0" w:lastRow="0" w:firstColumn="1" w:lastColumn="0" w:oddVBand="0" w:evenVBand="0" w:oddHBand="0" w:evenHBand="0" w:firstRowFirstColumn="0" w:firstRowLastColumn="0" w:lastRowFirstColumn="0" w:lastRowLastColumn="0"/>
@@ -23228,6 +23412,15 @@
                 <w:lang w:eastAsia="en-IN"/>
               </w:rPr>
             </w:pPr>
+            <w:r>
+              <w:rPr>
+                <w:rFonts w:ascii="Courier New" w:eastAsia="Times New Roman" w:hAnsi="Courier New" w:cs="Courier New"/>
+                <w:sz w:val="20"/>
+                <w:szCs w:val="20"/>
+                <w:lang w:eastAsia="en-IN"/>
+              </w:rPr>
+              <w:t>16.</w:t>
+            </w:r>
           </w:p>
         </w:tc>
         <w:tc>
@@ -23287,6 +23480,7 @@
       <w:tr>
         <w:trPr>
           <w:cnfStyle w:val="000000100000" w:firstRow="0" w:lastRow="0" w:firstColumn="0" w:lastColumn="0" w:oddVBand="0" w:evenVBand="0" w:oddHBand="1" w:evenHBand="0" w:firstRowFirstColumn="0" w:firstRowLastColumn="0" w:lastRowFirstColumn="0" w:lastRowLastColumn="0"/>
+          <w:trHeight w:val="458"/>
         </w:trPr>
         <w:tc>
           <w:tcPr>
@@ -23302,6 +23496,15 @@
                 <w:lang w:eastAsia="en-IN"/>
               </w:rPr>
             </w:pPr>
+            <w:r>
+              <w:rPr>
+                <w:rFonts w:ascii="Courier New" w:eastAsia="Times New Roman" w:hAnsi="Courier New" w:cs="Courier New"/>
+                <w:sz w:val="20"/>
+                <w:szCs w:val="20"/>
+                <w:lang w:eastAsia="en-IN"/>
+              </w:rPr>
+              <w:t>17.</w:t>
+            </w:r>
           </w:p>
         </w:tc>
         <w:tc>
@@ -23359,6 +23562,9 @@
         </w:tc>
       </w:tr>
       <w:tr>
+        <w:trPr>
+          <w:trHeight w:val="458"/>
+        </w:trPr>
         <w:tc>
           <w:tcPr>
             <w:cnfStyle w:val="001000000000" w:firstRow="0" w:lastRow="0" w:firstColumn="1" w:lastColumn="0" w:oddVBand="0" w:evenVBand="0" w:oddHBand="0" w:evenHBand="0" w:firstRowFirstColumn="0" w:firstRowLastColumn="0" w:lastRowFirstColumn="0" w:lastRowLastColumn="0"/>
@@ -23373,6 +23579,15 @@
                 <w:lang w:eastAsia="en-IN"/>
               </w:rPr>
             </w:pPr>
+            <w:r>
+              <w:rPr>
+                <w:rFonts w:ascii="Courier New" w:eastAsia="Times New Roman" w:hAnsi="Courier New" w:cs="Courier New"/>
+                <w:sz w:val="20"/>
+                <w:szCs w:val="20"/>
+                <w:lang w:eastAsia="en-IN"/>
+              </w:rPr>
+              <w:t>18.</w:t>
+            </w:r>
           </w:p>
         </w:tc>
         <w:tc>
@@ -23432,6 +23647,7 @@
       <w:tr>
         <w:trPr>
           <w:cnfStyle w:val="000000100000" w:firstRow="0" w:lastRow="0" w:firstColumn="0" w:lastColumn="0" w:oddVBand="0" w:evenVBand="0" w:oddHBand="1" w:evenHBand="0" w:firstRowFirstColumn="0" w:firstRowLastColumn="0" w:lastRowFirstColumn="0" w:lastRowLastColumn="0"/>
+          <w:trHeight w:val="458"/>
         </w:trPr>
         <w:tc>
           <w:tcPr>
@@ -23447,6 +23663,15 @@
                 <w:lang w:eastAsia="en-IN"/>
               </w:rPr>
             </w:pPr>
+            <w:r>
+              <w:rPr>
+                <w:rFonts w:ascii="Courier New" w:eastAsia="Times New Roman" w:hAnsi="Courier New" w:cs="Courier New"/>
+                <w:sz w:val="20"/>
+                <w:szCs w:val="20"/>
+                <w:lang w:eastAsia="en-IN"/>
+              </w:rPr>
+              <w:t>19.</w:t>
+            </w:r>
           </w:p>
         </w:tc>
         <w:tc>
@@ -23504,6 +23729,9 @@
         </w:tc>
       </w:tr>
       <w:tr>
+        <w:trPr>
+          <w:trHeight w:val="458"/>
+        </w:trPr>
         <w:tc>
           <w:tcPr>
             <w:cnfStyle w:val="001000000000" w:firstRow="0" w:lastRow="0" w:firstColumn="1" w:lastColumn="0" w:oddVBand="0" w:evenVBand="0" w:oddHBand="0" w:evenHBand="0" w:firstRowFirstColumn="0" w:firstRowLastColumn="0" w:lastRowFirstColumn="0" w:lastRowLastColumn="0"/>
@@ -23518,6 +23746,15 @@
                 <w:lang w:eastAsia="en-IN"/>
               </w:rPr>
             </w:pPr>
+            <w:r>
+              <w:rPr>
+                <w:rFonts w:ascii="Courier New" w:eastAsia="Times New Roman" w:hAnsi="Courier New" w:cs="Courier New"/>
+                <w:sz w:val="20"/>
+                <w:szCs w:val="20"/>
+                <w:lang w:eastAsia="en-IN"/>
+              </w:rPr>
+              <w:t>20.</w:t>
+            </w:r>
           </w:p>
         </w:tc>
         <w:tc>
@@ -23577,6 +23814,7 @@
       <w:tr>
         <w:trPr>
           <w:cnfStyle w:val="000000100000" w:firstRow="0" w:lastRow="0" w:firstColumn="0" w:lastColumn="0" w:oddVBand="0" w:evenVBand="0" w:oddHBand="1" w:evenHBand="0" w:firstRowFirstColumn="0" w:firstRowLastColumn="0" w:lastRowFirstColumn="0" w:lastRowLastColumn="0"/>
+          <w:trHeight w:val="438"/>
         </w:trPr>
         <w:tc>
           <w:tcPr>
@@ -23592,6 +23830,15 @@
                 <w:lang w:eastAsia="en-IN"/>
               </w:rPr>
             </w:pPr>
+            <w:r>
+              <w:rPr>
+                <w:rFonts w:ascii="Courier New" w:eastAsia="Times New Roman" w:hAnsi="Courier New" w:cs="Courier New"/>
+                <w:sz w:val="20"/>
+                <w:szCs w:val="20"/>
+                <w:lang w:eastAsia="en-IN"/>
+              </w:rPr>
+              <w:t>21.</w:t>
+            </w:r>
           </w:p>
         </w:tc>
         <w:tc>
@@ -23649,6 +23896,9 @@
         </w:tc>
       </w:tr>
       <w:tr>
+        <w:trPr>
+          <w:trHeight w:val="458"/>
+        </w:trPr>
         <w:tc>
           <w:tcPr>
             <w:cnfStyle w:val="001000000000" w:firstRow="0" w:lastRow="0" w:firstColumn="1" w:lastColumn="0" w:oddVBand="0" w:evenVBand="0" w:oddHBand="0" w:evenHBand="0" w:firstRowFirstColumn="0" w:firstRowLastColumn="0" w:lastRowFirstColumn="0" w:lastRowLastColumn="0"/>
@@ -23663,6 +23913,15 @@
                 <w:lang w:eastAsia="en-IN"/>
               </w:rPr>
             </w:pPr>
+            <w:r>
+              <w:rPr>
+                <w:rFonts w:ascii="Courier New" w:eastAsia="Times New Roman" w:hAnsi="Courier New" w:cs="Courier New"/>
+                <w:sz w:val="20"/>
+                <w:szCs w:val="20"/>
+                <w:lang w:eastAsia="en-IN"/>
+              </w:rPr>
+              <w:t>22.</w:t>
+            </w:r>
           </w:p>
         </w:tc>
         <w:tc>
@@ -23722,6 +23981,7 @@
       <w:tr>
         <w:trPr>
           <w:cnfStyle w:val="000000100000" w:firstRow="0" w:lastRow="0" w:firstColumn="0" w:lastColumn="0" w:oddVBand="0" w:evenVBand="0" w:oddHBand="1" w:evenHBand="0" w:firstRowFirstColumn="0" w:firstRowLastColumn="0" w:lastRowFirstColumn="0" w:lastRowLastColumn="0"/>
+          <w:trHeight w:val="458"/>
         </w:trPr>
         <w:tc>
           <w:tcPr>
@@ -23737,6 +23997,15 @@
                 <w:lang w:eastAsia="en-IN"/>
               </w:rPr>
             </w:pPr>
+            <w:r>
+              <w:rPr>
+                <w:rFonts w:ascii="Courier New" w:eastAsia="Times New Roman" w:hAnsi="Courier New" w:cs="Courier New"/>
+                <w:sz w:val="20"/>
+                <w:szCs w:val="20"/>
+                <w:lang w:eastAsia="en-IN"/>
+              </w:rPr>
+              <w:t>23.</w:t>
+            </w:r>
           </w:p>
         </w:tc>
         <w:tc>
@@ -23794,6 +24063,9 @@
         </w:tc>
       </w:tr>
       <w:tr>
+        <w:trPr>
+          <w:trHeight w:val="458"/>
+        </w:trPr>
         <w:tc>
           <w:tcPr>
             <w:cnfStyle w:val="001000000000" w:firstRow="0" w:lastRow="0" w:firstColumn="1" w:lastColumn="0" w:oddVBand="0" w:evenVBand="0" w:oddHBand="0" w:evenHBand="0" w:firstRowFirstColumn="0" w:firstRowLastColumn="0" w:lastRowFirstColumn="0" w:lastRowLastColumn="0"/>
@@ -23808,6 +24080,15 @@
                 <w:lang w:eastAsia="en-IN"/>
               </w:rPr>
             </w:pPr>
+            <w:r>
+              <w:rPr>
+                <w:rFonts w:ascii="Courier New" w:eastAsia="Times New Roman" w:hAnsi="Courier New" w:cs="Courier New"/>
+                <w:sz w:val="20"/>
+                <w:szCs w:val="20"/>
+                <w:lang w:eastAsia="en-IN"/>
+              </w:rPr>
+              <w:t>24.</w:t>
+            </w:r>
           </w:p>
         </w:tc>
         <w:tc>
@@ -23867,6 +24148,7 @@
       <w:tr>
         <w:trPr>
           <w:cnfStyle w:val="000000100000" w:firstRow="0" w:lastRow="0" w:firstColumn="0" w:lastColumn="0" w:oddVBand="0" w:evenVBand="0" w:oddHBand="1" w:evenHBand="0" w:firstRowFirstColumn="0" w:firstRowLastColumn="0" w:lastRowFirstColumn="0" w:lastRowLastColumn="0"/>
+          <w:trHeight w:val="458"/>
         </w:trPr>
         <w:tc>
           <w:tcPr>
@@ -23882,6 +24164,15 @@
                 <w:lang w:eastAsia="en-IN"/>
               </w:rPr>
             </w:pPr>
+            <w:r>
+              <w:rPr>
+                <w:rFonts w:ascii="Courier New" w:eastAsia="Times New Roman" w:hAnsi="Courier New" w:cs="Courier New"/>
+                <w:sz w:val="20"/>
+                <w:szCs w:val="20"/>
+                <w:lang w:eastAsia="en-IN"/>
+              </w:rPr>
+              <w:t>25.</w:t>
+            </w:r>
           </w:p>
         </w:tc>
         <w:tc>
@@ -23939,6 +24230,9 @@
         </w:tc>
       </w:tr>
       <w:tr>
+        <w:trPr>
+          <w:trHeight w:val="458"/>
+        </w:trPr>
         <w:tc>
           <w:tcPr>
             <w:cnfStyle w:val="001000000000" w:firstRow="0" w:lastRow="0" w:firstColumn="1" w:lastColumn="0" w:oddVBand="0" w:evenVBand="0" w:oddHBand="0" w:evenHBand="0" w:firstRowFirstColumn="0" w:firstRowLastColumn="0" w:lastRowFirstColumn="0" w:lastRowLastColumn="0"/>
@@ -23953,6 +24247,15 @@
                 <w:lang w:eastAsia="en-IN"/>
               </w:rPr>
             </w:pPr>
+            <w:r>
+              <w:rPr>
+                <w:rFonts w:ascii="Courier New" w:eastAsia="Times New Roman" w:hAnsi="Courier New" w:cs="Courier New"/>
+                <w:sz w:val="20"/>
+                <w:szCs w:val="20"/>
+                <w:lang w:eastAsia="en-IN"/>
+              </w:rPr>
+              <w:t>26.</w:t>
+            </w:r>
           </w:p>
         </w:tc>
         <w:tc>
@@ -24012,6 +24315,7 @@
       <w:tr>
         <w:trPr>
           <w:cnfStyle w:val="000000100000" w:firstRow="0" w:lastRow="0" w:firstColumn="0" w:lastColumn="0" w:oddVBand="0" w:evenVBand="0" w:oddHBand="1" w:evenHBand="0" w:firstRowFirstColumn="0" w:firstRowLastColumn="0" w:lastRowFirstColumn="0" w:lastRowLastColumn="0"/>
+          <w:trHeight w:val="438"/>
         </w:trPr>
         <w:tc>
           <w:tcPr>
@@ -24027,6 +24331,15 @@
                 <w:lang w:eastAsia="en-IN"/>
               </w:rPr>
             </w:pPr>
+            <w:r>
+              <w:rPr>
+                <w:rFonts w:ascii="Courier New" w:eastAsia="Times New Roman" w:hAnsi="Courier New" w:cs="Courier New"/>
+                <w:sz w:val="20"/>
+                <w:szCs w:val="20"/>
+                <w:lang w:eastAsia="en-IN"/>
+              </w:rPr>
+              <w:t>27.</w:t>
+            </w:r>
           </w:p>
         </w:tc>
         <w:tc>
@@ -24084,6 +24397,7 @@
         </w:tc>
       </w:tr>
     </w:tbl>
+    <w:p/>
     <w:p/>
     <w:sectPr>
       <w:pgSz w:w="11906" w:h="16838"/>
@@ -32175,6 +32489,7 @@
   <w:style w:type="character" w:default="1" w:styleId="DefaultParagraphFont">
     <w:name w:val="Default Paragraph Font"/>
     <w:uiPriority w:val="1"/>
+    <w:semiHidden/>
     <w:unhideWhenUsed/>
   </w:style>
   <w:style w:type="table" w:default="1" w:styleId="TableNormal">

</xml_diff>